<commit_message>
Update legal and privacy disclosures
</commit_message>
<xml_diff>
--- a/docs/juridico/minuta-contratual-clientes-manos-tech.docx
+++ b/docs/juridico/minuta-contratual-clientes-manos-tech.docx
@@ -66,7 +66,7 @@
         <w:jc w:val="center"/>
       </w:pPr>
       <w:r>
-        <w:t>Versão de trabalho 1.0  |  7 de outubro de 2026</w:t>
+        <w:t>Versão de trabalho 1.1  |  13 de outubro de 2026</w:t>
       </w:r>
     </w:p>
     <w:p/>
@@ -82,7 +82,7 @@
     </w:p>
     <w:p>
       <w:r>
-        <w:t xml:space="preserve">Status do documento  </w:t>
+        <w:t>Status do documento  Esta minuta continua em revisão e não deve ser assinada enquanto houver campos pendentes. Os dados empresariais já confirmados foram inseridos; condições comerciais, prazos operacionais, retenção integral, fornecedores e mecanismos de transferência internacional ainda exigem validação.</w:t>
       </w:r>
     </w:p>
     <w:p>
@@ -450,7 +450,7 @@
     </w:p>
     <w:p>
       <w:r>
-        <w:t>Campos pendentes essenciais: razão social, CNPJ, endereço, representante legal, canal de privacidade, planos, valores, vencimento, prazo de implantação, atendimento, cancelamento, retenção e foro.</w:t>
+        <w:t>Pendências pré-assinatura: representante legal da Manos Tech; identificação da CONTRATANTE; canal de privacidade e incidentes; plano, módulos, valores e vencimento; implantação; suporte e disponibilidade; cancelamento; retenção por categoria; inventário de fornecedores, países e mecanismo de transferência internacional; foro; revisão por advogado.</w:t>
       </w:r>
     </w:p>
     <w:p>
@@ -620,7 +620,7 @@
               <w:rPr>
                 <w:sz w:val="18"/>
               </w:rPr>
-              <w:t>[RAZÃO SOCIAL DA MANOS TECH], nome fantasia Manos Tech, CNPJ [PREENCHER], com sede em [PREENCHER], representada por [PREENCHER], e-mail [PREENCHER].</w:t>
+              <w:t>Manos Tech LTDA, nome fantasia Manos Tech, CNPJ 52.499.913/0001-06, com sede em Navegantes - SC, representada por [PREENCHER REPRESENTANTE LEGAL], telefone (47) 99704-9730, e-mail manostech.suporte@gmail.com. Encarregado pessoa jurídica: Manos Tech LTDA; pessoa natural responsável: Gabriel Juvencio.</w:t>
             </w:r>
           </w:p>
         </w:tc>
@@ -2314,11 +2314,9 @@
         <w:rPr>
           <w:b/>
         </w:rPr>
-        <w:t xml:space="preserve">5.2 Relação de fornecedores.  </w:t>
+        <w:t>5.2 Relação de fornecedores.  O inventário completo ainda precisa ser confirmado antes da contratação. A verificação preliminar identifica Supabase (banco principal na região ca-central-1, Canadá) e Cloudflare R2 (armazenamento de backups; localidade específica a confirmar). Devem ser incluídos os demais provedores efetivamente habilitados para hospedagem, IA, mensageria e pagamentos, indicando serviço, categorias de dados, país, suboperadores e mecanismo de transferência internacional aplicável. Não assinar este Anexo antes de completar e validar essa relação.</w:t>
       </w:r>
-      <w:r>
-        <w:t>A lista inicial de suboperadores e países de tratamento deverá ser preenchida na Ordem de Serviço ou em página mantida pela CONTRATADA: [PREENCHER].</w:t>
-      </w:r>
+      <w:r/>
     </w:p>
     <w:p>
       <w:pPr>
@@ -2414,11 +2412,9 @@
         <w:rPr>
           <w:b/>
         </w:rPr>
-        <w:t xml:space="preserve">7.1 Notificação.  </w:t>
+        <w:t>7.1 Notificação.  Ao confirmar incidente sob sua responsabilidade que possa acarretar risco ou dano relevante, a CONTRATADA notificará a CONTRATANTE sem demora indevida pelo canal definido na Ordem de Serviço. Quando atuar como operadora, a CONTRATADA fornecerá os elementos disponíveis para apoiar a avaliação do controlador. A CONTRATANTE, como controladora, avaliará e realizará as comunicações à ANPD e aos titulares dentro do prazo regulamentar aplicável, atualmente de até 3 dias úteis para incidentes comunicáveis, ressalvada regra específica.</w:t>
       </w:r>
-      <w:r>
-        <w:t>Ao confirmar incidente sob sua responsabilidade que possa acarretar risco ou dano relevante, a CONTRATADA notificará a CONTRATANTE sem demora indevida pelo canal [PREENCHER].</w:t>
-      </w:r>
+      <w:r/>
     </w:p>
     <w:p>
       <w:pPr>
@@ -2464,11 +2460,9 @@
         <w:rPr>
           <w:b/>
         </w:rPr>
-        <w:t xml:space="preserve">8.1 Tabela de retenção.  </w:t>
+        <w:t>8.1 Tabela de retenção.  Os prazos por categoria devem constar da Ordem de Serviço e da política aplicável. A implementação atual prevê 30 dias para registros de auditoria do HotSpot, 45 dias sem atividade relevante para o histórico do agente de IA e 35 dias para backups do banco no R2. Esses prazos não definem a retenção dos dados ativos de visitantes, solicitações de privacidade, comprovantes de consentimento ou registros financeiros; preencher essas categorias antes da assinatura.</w:t>
       </w:r>
-      <w:r>
-        <w:t>Os prazos por categoria serão documentados na política e na Ordem de Serviço. A CONTRATANTE configurará ou solicitará exclusões compatíveis com suas finalidades e obrigações.</w:t>
-      </w:r>
+      <w:r/>
     </w:p>
     <w:p>
       <w:pPr>

</xml_diff>